<commit_message>
Refine Energy Transfer and Collision week
Co-authored-by: Cursor <cursoragent@cursor.com>
</commit_message>
<xml_diff>
--- a/production/worksheets/05-ch5-crash-lab-student.docx
+++ b/production/worksheets/05-ch5-crash-lab-student.docx
@@ -29,7 +29,7 @@
           <w:color w:val="555555"/>
           <w:sz w:val="22"/>
         </w:rPr>
-        <w:t>Chapter 5 · Collisions Transfer Energy · Week 6</w:t>
+        <w:t>Chapter 5 · Collisions Transfer Energy · Week 3</w:t>
       </w:r>
     </w:p>
     <w:p>
@@ -632,7 +632,7 @@
           <w:color w:val="1F3A5F"/>
           <w:sz w:val="26"/>
         </w:rPr>
-        <w:t>PART B — MASS / WEIGHT</w:t>
+        <w:t>PART B — MASS / WEIGHT (OPTIONAL extension — separate fair test)</w:t>
       </w:r>
     </w:p>
     <w:p>

</xml_diff>